<commit_message>
Add missing Lecture 3 concepts: league definition, 4 functions, balance vs domination, matchday ≠ profit
https://claude.ai/code/session_0173BnhphzLp9YVGHJWd64yF
</commit_message>
<xml_diff>
--- a/Экономика_спорта_ответы_к_зачету.docx
+++ b/Экономика_спорта_ответы_к_зачету.docx
@@ -48,6 +48,11 @@
     <w:p>
       <w:r>
         <w:t>В макроэкономике коопетиция описывается также как «конкурентное сотрудничество», «конкурентное сосуществование», «кластерное взаимодействие». Ключевая суть: объединение усилий для увеличения общей ценности при одновременной борьбе за долю этой ценности.</w:t>
+      </w:r>
+    </w:p>
+    <w:p>
+      <w:r>
+        <w:t>Принцип, вытекающий из коопетиции: лига заинтересована в конкурентном балансе, а не в том, чтобы один клуб всегда побеждал. Главная цель любой лиги — максимизация ценности всего чемпионата, а не прибыли отдельного клуба. Именно поэтому механизмы выравнивания (salary cap, драфт, перераспределение ТВ-доходов) — это не антирыночные ограничения, а необходимое условие существования самого рынка.</w:t>
       </w:r>
     </w:p>
     <w:p>
@@ -179,6 +184,29 @@
       </w:pPr>
       <w:r>
         <w:t>Ответ:</w:t>
+      </w:r>
+    </w:p>
+    <w:p>
+      <w:r>
+        <w:t>ОПРЕДЕЛЕНИЕ СПОРТИВНОЙ ЛИГИ: Спортивная лига — это институциональная форма организации соревнований, объединяющая клубы или команды для регулярного проведения матчей по установленным правилам, с целью создания и продажи спортивного продукта. Лига продаёт не матчи, а: внимание аудитории, неопределённость результата, регулярный контент (сезон), эмоции и идентичность. Матч сам по себе не продукт — продукт = система соревнований. Главная цель любой лиги — максимизация ценности всего чемпионата, а не прибыли отдельного клуба. Именно поэтому лига заинтересована в конкурентной среде, а не в том, чтобы один клуб доминировал.</w:t>
+      </w:r>
+    </w:p>
+    <w:p>
+      <w:r>
+        <w:t>4 ФУНКЦИИ ЛИГИ (по Лекции 3):</w:t>
+        <w:br/>
+        <w:t>1. Координация — единое расписание, регламент, судейство, трансферные окна;</w:t>
+        <w:br/>
+        <w:t>2. Создание продукта — производство соревновательного контента (сезон = продукт);</w:t>
+        <w:br/>
+        <w:t>3. Обеспечение конкурентного баланса — механизмы выравнивания сил (salary cap, драфт, распределение доходов);</w:t>
+        <w:br/>
+        <w:t>4. Коммерциализация — централизованная продажа медиаправ, спонсорских пакетов, управление брендом лиги.</w:t>
+      </w:r>
+    </w:p>
+    <w:p>
+      <w:r>
+        <w:t>Конкурентный баланс — это примерное равенство сил участников, обеспечивающее неопределённость исхода. Без него зрительский интерес падает. Резюме: лига — координационный механизм; доход — монетизация внимания; баланс важнее доминирования.</w:t>
       </w:r>
     </w:p>
     <w:p>
@@ -437,6 +465,11 @@
     <w:p>
       <w:r>
         <w:t>Особенности РПЛ: основной доход — ТВ-права и спонсорство. Доходы от matchday в России значительно ниже, чем в европейских лигах (меньше VIP-зон, слабая активация спонсоров, Fan ID снизил посещаемость). Государство и госкорпорации дотируют большинство клубов.</w:t>
+      </w:r>
+    </w:p>
+    <w:p>
+      <w:r>
+        <w:t>ВАЖНЫЙ ПРИНЦИП: ЗАПОЛНЯЕМОСТЬ СТАДИОНА ≠ ПРИБЫЛЬ. Высокая посещаемость не означает высокий доход, если стоимость билетов низкая или операционные расходы на организацию матча высоки. Пример: в Европе VIP-ложи и премиальный hospitality дают больший вклад в matchday-выручку, чем массовые билеты по низкой цене. В России — противоположная ситуация: Fan ID (система идентификации болельщиков) значительно снизил посещаемость в РПЛ, особенно в 2022–2024 гг. Снижение посещаемости в России не компенсировалось ростом цены билета — в итоге matchday-доходы упали.</w:t>
       </w:r>
     </w:p>
     <w:p>

</xml_diff>

<commit_message>
Add Lecture 2 content: economics of impressions, media rights 2026 figures, monopsony, price discrimination 3rd degree, Veblen good, fan audience portrait 2026
https://claude.ai/code/session_0173BnhphzLp9YVGHJWd64yF
</commit_message>
<xml_diff>
--- a/Экономика_спорта_ответы_к_зачету.docx
+++ b/Экономика_спорта_ответы_к_зачету.docx
@@ -355,6 +355,11 @@
     </w:p>
     <w:p>
       <w:r>
+        <w:t>ЭКОНОМИКА ВПЕЧАТЛЕНИЙ В СПОРТЕ: В XXI веке спорт перестал быть просто формой досуга — это полноценная отрасль глобальной экономики. Профессиональный спорт функционирует как рынок с монополистической конкуренцией, где главный товар — эмоции и уникальный пользовательский опыт. Монополистическая конкуренция — тип рыночной структуры, где много продавцов предлагают похожие, но не идентичные (дифференцированные) товары. Каждый клуб обладает «монополией» на свой бренд и свою болельщицкую идентичность, но конкурирует с другими развлечениями за время и деньги аудитории. Экономика впечатлений — концепция, в которой главной ценностью становятся эмоции, ощущения и уникальный опыт, а не просто физические товары или услуги. Клуб продаёт не «матч», а переживание, причастность, идентичность.</w:t>
+      </w:r>
+    </w:p>
+    <w:p>
+      <w:r>
         <w:t>Спрос в экономике спорта обладает рядом уникальных характеристик, отличающих его от спроса на обычные потребительские товары.</w:t>
       </w:r>
     </w:p>
@@ -464,12 +469,17 @@
     </w:p>
     <w:p>
       <w:r>
+        <w:t>АКТУАЛЬНЫЕ ДАННЫЕ ПО МЕДИАПРАВАМ 2026 (мировой рынок): Глобальный рынок медиаправ вырастет с $58 млрд (2025) до более $66 млрд (2026). Топ-5 самых дорогих прав: NFL — $110+ млрд за 11 лет (~$10 млрд/сезон); NBA — $76 млрд за 11 лет (~$6.9 млрд/сезон, с Disney/ESPN, NBC, Amazon); UEFA Champions League — €5+ млрд/год с 2027 г.; Олимпийские игры — $7.65 млрд за 12 лет (NBCUniversal, США); FIFA ЧМ-2026 — $4.264 млрд от ТВ-прав. Стриминговые платформы в 2026 г. потратили $14.2 млрд на спортивные права (+7% к 2025 г.). Контракт РПЛ с «Матч ТВ» на 2026–2030 гг. — 28.5 млрд руб. (~$92 млн/год) — в сотни раз меньше мировых лидеров.</w:t>
+      </w:r>
+    </w:p>
+    <w:p>
+      <w:r>
         <w:t>Особенности РПЛ: основной доход — ТВ-права и спонсорство. Доходы от matchday в России значительно ниже, чем в европейских лигах (меньше VIP-зон, слабая активация спонсоров, Fan ID снизил посещаемость). Государство и госкорпорации дотируют большинство клубов.</w:t>
       </w:r>
     </w:p>
     <w:p>
       <w:r>
-        <w:t>ВАЖНЫЙ ПРИНЦИП: ЗАПОЛНЯЕМОСТЬ СТАДИОНА ≠ ПРИБЫЛЬ. Высокая посещаемость не означает высокий доход, если стоимость билетов низкая или операционные расходы на организацию матча высоки. Пример: в Европе VIP-ложи и премиальный hospitality дают больший вклад в matchday-выручку, чем массовые билеты по низкой цене. В России — противоположная ситуация: Fan ID (система идентификации болельщиков) значительно снизил посещаемость в РПЛ, особенно в 2022–2024 гг. Снижение посещаемости в России не компенсировалось ростом цены билета — в итоге matchday-доходы упали.</w:t>
+        <w:t>ВАЖНЫЙ ПРИНЦИП: ЗАПОЛНЯЕМОСТЬ СТАДИОНА ≠ ПРИБЫЛЬ. Высокая посещаемость не означает высокий доход, если стоимость билетов низкая или операционные расходы на организацию матча высоки. Пример: в Европе VIP-ложи и премиальный hospitality дают больший вклад в matchday-выручку, чем массовые билеты по низкой цене. В России — противоположная ситуация: Fan ID (система идентификации болельщиков) значительно снизил посещаемость в РПЛ, особенно в 2022–2024 гг. По данным 2026 года: средняя посещаемость при Fan ID — менее 40% от общей вместимости. Снижение посещаемости не компенсировалось ростом цены билета — в итоге matchday-доходы упали. Средняя цена билета на матч РПЛ в 2025/2026 — 600–800 рублей (в 100 раз дешевле Суперкубка США). Наследие ЧМ-2018: стадионы с избыточной вместимостью (45 000+) создают высокие операционные расходы при низкой заполняемости в регионах — экономика стадиона убыточна без государственных дотаций.</w:t>
       </w:r>
     </w:p>
     <w:p>
@@ -512,6 +522,11 @@
     <w:p>
       <w:r>
         <w:t>Парадокс спорта: лиги функционируют как картели (согласованные действия участников), но это легально — потому что без картелизации (единого расписания, стандартов) спортивный продукт не существует. Именно поэтому спорт часто освобождён от антимонопольного регулирования (исключение из антитрестовского закона для NFL в США).</w:t>
+      </w:r>
+    </w:p>
+    <w:p>
+      <w:r>
+        <w:t>МОНОПСОНИЯ в спорте — особый случай рыночной структуры, где один покупатель диктует условия множеству продавцов. В России на рынке медиаправ сложилась монопсония с государственным участием: основные покупатели — «Матч ТВ» (входит в «Газпром-Медиа Холдинг») и «Okko Спорт» (структура Сбербанка). Рыночная конкуренция ограничена, стоимость прав кратно ниже мировых аналогов ($92 млн/год для РПЛ vs $2 млрд/год для АПЛ). Это контрастирует с глобальным рынком, где права продаются на тендерах с участием Big Tech (Amazon, Apple, Netflix), что разгоняет цены до рекордных значений.</w:t>
       </w:r>
     </w:p>
     <w:p>
@@ -826,6 +841,16 @@
     </w:p>
     <w:p>
       <w:r>
+        <w:t>ЦЕНОВАЯ ДИСКРИМИНАЦИЯ ТРЕТЬЕЙ СТЕПЕНИ: Клубы применяют ценовую дискриминацию третьей степени — один и тот же товар (билет) продаётся разным группам потребителей по разным ценам на основании эластичности спроса. Продавец делит покупателей на сегменты (возраст, доход, локация) и устанавливает более высокую цену для неэластичного спроса (VIP, финалы) и низкую — для высокоэластичного (студенты, регионы). AI-алгоритмы корректируют цены в реальном времени (Revenue Management).</w:t>
+      </w:r>
+    </w:p>
+    <w:p>
+      <w:r>
+        <w:t>VEBLEN GOOD (статусное благо) в билетной индустрии: на отдельные события чем дороже — тем выше спрос у определённого сегмента. Пример: средняя цена билета на Супербоул-2026 достигала $8 600, на вторичном рынке — свыше $20 000. VIP-пакеты приносят 40% билетной выручки при занимающих лишь 5% мест.</w:t>
+      </w:r>
+    </w:p>
+    <w:p>
+      <w:r>
         <w:t>ДИНАМИЧЕСКОЕ ЦЕНООБРАЗОВАНИЕ (Dynamic Pricing):</w:t>
         <w:br/>
         <w:t>Это система ценообразования, при которой стоимость билета меняется в реальном времени в зависимости от спроса, времени до события, доступности мест и других факторов — по аналогии с авиабилетами и гостиницами.</w:t>
@@ -916,6 +941,28 @@
     <w:p>
       <w:r>
         <w:t>7. ТРЕБОВАНИЕ АУТЕНТИЧНОСТИ И СОЦИАЛЬНОЙ ОТВЕТСТВЕННОСТИ: Болельщики хотят знать позицию клуба по ESG-вопросам. Влияние: клубы инвестируют в социальные программы; скандалы вокруг спонсоров с негативной репутацией.</w:t>
+      </w:r>
+    </w:p>
+    <w:p>
+      <w:r>
+        <w:t>ПОРТРЕТ АУДИТОРИИ 2026 (данные из лекционных материалов МГУ):</w:t>
+        <w:br/>
+        <w:t>Мировая аудитория: 76% фанатов — Millennials и Gen Z; 34% имеют доход $100K+ в год; 67% футбольных фанатов считают бренды-спонсоры более привлекательными (vs 54% обычных потребителей); доля женщин — 44% (рост с 40% в 2022 г.). Millennials: 49% смотрят спорт ежедневно, 85% — преданные фанаты, лидируют по числу платных подписок. Gen Z: лояльность к спортсменам, а не к клубам; потребляют хайлайты (Reels, Shorts) вместо полного матча.</w:t>
+      </w:r>
+    </w:p>
+    <w:p>
+      <w:r>
+        <w:t>Российский болельщик vs мировой (2026):</w:t>
+        <w:br/>
+        <w:t>— Доход $100K+: мир — 34%, Россия — &lt;5%;</w:t>
+        <w:br/>
+        <w:t>— Готовность платить за спорт: мир — 67%, Россия — 35%;</w:t>
+        <w:br/>
+        <w:t>— Основной канал: мир — стриминг 65%, Россия — ТВ, YouTube, VK;</w:t>
+        <w:br/>
+        <w:t>— 62% российских зрителей предпочтут бесплатное ТВ даже при худшем качестве;</w:t>
+        <w:br/>
+        <w:t>— Региональная дифференциация: Москва/СПб — платёжеспособный спрос в 3–4 раза выше, чем в среднем по стране.</w:t>
       </w:r>
     </w:p>
     <w:p>

</xml_diff>